<commit_message>
Renombra Ortografía a Acentuación y rellena las fichas de Lengua sin usar toda la página
Cambia el nombre del primer apartado de Lengua de "Ortografía" a
"Acentuación" (título, menú e índice), ya que su contenido trata la
sílaba tónica, agudas/llanas/esdrújulas/sobresdrújulas y diptongo/
hiato/triptongo.

Además, revisa las 29 fichas de Lengua generadas anteriormente: casi
todas dejaban una segunda página casi vacía (con solo 2-8 líneas de
un ejercicio, entre el 9% y el 25% de aprovechamiento). Se añade a
cada una una 4ª sección "Verdadero o falso" con 18 afirmaciones
propias del tema (y sus respuestas en la hoja de soluciones), lo que
eleva el aprovechamiento de la segunda página al 64-79%, en línea con
las fichas de Matemáticas, sin añadir una tercera página en ningún
caso.

Co-Authored-By: Claude Sonnet 5 <noreply@anthropic.com>
</commit_message>
<xml_diff>
--- a/fichas/lengua/ficha_lengua_adjetivo_5.docx
+++ b/fichas/lengua/ficha_lengua_adjetivo_5.docx
@@ -743,6 +743,267 @@
     </w:p>
     <w:p>
       <w:pPr>
+        <w:spacing w:after="40"/>
+      </w:pPr>
+    </w:p>
+    <w:tbl>
+      <w:tblPr>
+        <w:tblW w:type="auto" w:w="0"/>
+        <w:jc w:val="left"/>
+        <w:tblLayout w:type="fixed"/>
+        <w:tblLook w:firstColumn="1" w:firstRow="1" w:lastColumn="0" w:lastRow="0" w:noHBand="0" w:noVBand="1" w:val="04A0"/>
+        <w:tblLayout w:type="fixed"/>
+        <w:tblW w:w="10034" w:type="dxa"/>
+        <w:tblInd w:w="0" w:type="dxa"/>
+      </w:tblPr>
+      <w:tblGrid>
+        <w:gridCol w:w="10092"/>
+      </w:tblGrid>
+      <w:tr>
+        <w:tc>
+          <w:tcPr>
+            <w:tcW w:type="dxa" w:w="10035"/>
+            <w:shd w:val="clear" w:color="auto" w:fill="595959"/>
+            <w:tcBorders>
+              <w:top w:val="single" w:sz="4" w:space="0" w:color="595959"/>
+              <w:left w:val="single" w:sz="4" w:space="0" w:color="595959"/>
+              <w:bottom w:val="single" w:sz="4" w:space="0" w:color="595959"/>
+              <w:right w:val="single" w:sz="4" w:space="0" w:color="595959"/>
+            </w:tcBorders>
+          </w:tcPr>
+          <w:p>
+            <w:pPr>
+              <w:spacing w:before="60" w:after="60"/>
+            </w:pPr>
+            <w:r>
+              <w:rPr>
+                <w:b/>
+                <w:color w:val="FFFFFF"/>
+                <w:sz w:val="25"/>
+              </w:rPr>
+              <w:t>4. VERDADERO O FALSO — Repasa lo aprendido</w:t>
+            </w:r>
+          </w:p>
+        </w:tc>
+      </w:tr>
+    </w:tbl>
+    <w:p>
+      <w:pPr>
+        <w:spacing w:after="40"/>
+      </w:pPr>
+    </w:p>
+    <w:p>
+      <w:pPr>
+        <w:spacing w:after="80"/>
+      </w:pPr>
+      <w:r>
+        <w:rPr>
+          <w:i/>
+          <w:sz w:val="22"/>
+        </w:rPr>
+        <w:t>Indica si cada afirmación es verdadera (V) o falsa (F).</w:t>
+      </w:r>
+    </w:p>
+    <w:p>
+      <w:pPr>
+        <w:spacing w:after="160"/>
+      </w:pPr>
+      <w:r>
+        <w:rPr>
+          <w:sz w:val="22"/>
+        </w:rPr>
+        <w:t xml:space="preserve">1. El adjetivo acompaña al sustantivo para describir cómo es. → ______________________</w:t>
+      </w:r>
+    </w:p>
+    <w:p>
+      <w:pPr>
+        <w:spacing w:after="160"/>
+      </w:pPr>
+      <w:r>
+        <w:rPr>
+          <w:sz w:val="22"/>
+        </w:rPr>
+        <w:t xml:space="preserve">2. Los gentilicios indican de dónde es alguien o algo. → ______________________</w:t>
+      </w:r>
+    </w:p>
+    <w:p>
+      <w:pPr>
+        <w:spacing w:after="160"/>
+      </w:pPr>
+      <w:r>
+        <w:rPr>
+          <w:sz w:val="22"/>
+        </w:rPr>
+        <w:t xml:space="preserve">3. El adjetivo concuerda en género y número con el sustantivo. → ______________________</w:t>
+      </w:r>
+    </w:p>
+    <w:p>
+      <w:pPr>
+        <w:spacing w:after="160"/>
+      </w:pPr>
+      <w:r>
+        <w:rPr>
+          <w:sz w:val="22"/>
+        </w:rPr>
+        <w:t xml:space="preserve">4. El grado comparativo del adjetivo es, por ejemplo, "más alto que". → ______________________</w:t>
+      </w:r>
+    </w:p>
+    <w:p>
+      <w:pPr>
+        <w:spacing w:after="160"/>
+      </w:pPr>
+      <w:r>
+        <w:rPr>
+          <w:sz w:val="22"/>
+        </w:rPr>
+        <w:t xml:space="preserve">5. El grado superlativo del adjetivo es, por ejemplo, "altísimo". → ______________________</w:t>
+      </w:r>
+    </w:p>
+    <w:p>
+      <w:pPr>
+        <w:spacing w:after="160"/>
+      </w:pPr>
+      <w:r>
+        <w:rPr>
+          <w:sz w:val="22"/>
+        </w:rPr>
+        <w:t xml:space="preserve">6. El grado positivo del adjetivo es la forma simple, como "alto". → ______________________</w:t>
+      </w:r>
+    </w:p>
+    <w:p>
+      <w:pPr>
+        <w:spacing w:after="160"/>
+      </w:pPr>
+      <w:r>
+        <w:rPr>
+          <w:sz w:val="22"/>
+        </w:rPr>
+        <w:t xml:space="preserve">7. El adjetivo nunca cambia de forma según el sustantivo. → ______________________</w:t>
+      </w:r>
+    </w:p>
+    <w:p>
+      <w:pPr>
+        <w:spacing w:after="160"/>
+      </w:pPr>
+      <w:r>
+        <w:rPr>
+          <w:sz w:val="22"/>
+        </w:rPr>
+        <w:t xml:space="preserve">8. "Español" y "madrileño" son ejemplos de gentilicios. → ______________________</w:t>
+      </w:r>
+    </w:p>
+    <w:p>
+      <w:pPr>
+        <w:spacing w:after="160"/>
+      </w:pPr>
+      <w:r>
+        <w:rPr>
+          <w:sz w:val="22"/>
+        </w:rPr>
+        <w:t xml:space="preserve">9. "Alto", "azul" y "feliz" son adjetivos calificativos. → ______________________</w:t>
+      </w:r>
+    </w:p>
+    <w:p>
+      <w:pPr>
+        <w:spacing w:after="160"/>
+      </w:pPr>
+      <w:r>
+        <w:rPr>
+          <w:sz w:val="22"/>
+        </w:rPr>
+        <w:t xml:space="preserve">10. Los gentilicios pueden funcionar como adjetivos. → ______________________</w:t>
+      </w:r>
+    </w:p>
+    <w:p>
+      <w:pPr>
+        <w:spacing w:after="160"/>
+      </w:pPr>
+      <w:r>
+        <w:rPr>
+          <w:sz w:val="22"/>
+        </w:rPr>
+        <w:t xml:space="preserve">11. "Más alto que" es un ejemplo de grado comparativo de superioridad. → ______________________</w:t>
+      </w:r>
+    </w:p>
+    <w:p>
+      <w:pPr>
+        <w:spacing w:after="160"/>
+      </w:pPr>
+      <w:r>
+        <w:rPr>
+          <w:sz w:val="22"/>
+        </w:rPr>
+        <w:t xml:space="preserve">12. "Tan alto como" es un ejemplo de grado comparativo de igualdad. → ______________________</w:t>
+      </w:r>
+    </w:p>
+    <w:p>
+      <w:pPr>
+        <w:spacing w:after="160"/>
+      </w:pPr>
+      <w:r>
+        <w:rPr>
+          <w:sz w:val="22"/>
+        </w:rPr>
+        <w:t xml:space="preserve">13. "Altísimo" es un ejemplo de grado superlativo. → ______________________</w:t>
+      </w:r>
+    </w:p>
+    <w:p>
+      <w:pPr>
+        <w:spacing w:after="160"/>
+      </w:pPr>
+      <w:r>
+        <w:rPr>
+          <w:sz w:val="22"/>
+        </w:rPr>
+        <w:t xml:space="preserve">14. El adjetivo concuerda en género y número con el sustantivo al que acompaña. → ______________________</w:t>
+      </w:r>
+    </w:p>
+    <w:p>
+      <w:pPr>
+        <w:spacing w:after="160"/>
+      </w:pPr>
+      <w:r>
+        <w:rPr>
+          <w:sz w:val="22"/>
+        </w:rPr>
+        <w:t xml:space="preserve">15. Un mismo adjetivo no puede aparecer en varios grados distintos. → ______________________</w:t>
+      </w:r>
+    </w:p>
+    <w:p>
+      <w:pPr>
+        <w:spacing w:after="160"/>
+      </w:pPr>
+      <w:r>
+        <w:rPr>
+          <w:sz w:val="22"/>
+        </w:rPr>
+        <w:t xml:space="preserve">16. Los adjetivos enriquecen la descripción de personas, animales o cosas. → ______________________</w:t>
+      </w:r>
+    </w:p>
+    <w:p>
+      <w:pPr>
+        <w:spacing w:after="160"/>
+      </w:pPr>
+      <w:r>
+        <w:rPr>
+          <w:sz w:val="22"/>
+        </w:rPr>
+        <w:t xml:space="preserve">17. "Estudioso" y "trabajador" pueden ser adjetivos calificativos. → ______________________</w:t>
+      </w:r>
+    </w:p>
+    <w:p>
+      <w:pPr>
+        <w:spacing w:after="160"/>
+      </w:pPr>
+      <w:r>
+        <w:rPr>
+          <w:sz w:val="22"/>
+        </w:rPr>
+        <w:t xml:space="preserve">18. Reconocer el grado del adjetivo ayuda a matizar una descripción. → ______________________</w:t>
+      </w:r>
+    </w:p>
+    <w:p>
+      <w:pPr>
         <w:spacing w:before="200"/>
         <w:jc w:val="center"/>
       </w:pPr>

</xml_diff>